<commit_message>
Changes in coursework report
</commit_message>
<xml_diff>
--- a/Coursework Report.docx
+++ b/Coursework Report.docx
@@ -234,11 +234,12 @@
         <w:rPr>
           <w:noProof/>
         </w:rPr>
+        <w:lastRenderedPageBreak/>
         <w:drawing>
-          <wp:inline distT="0" distB="0" distL="0" distR="0" wp14:anchorId="0C16FFE0" wp14:editId="644B128A">
-            <wp:extent cx="4516626" cy="1343890"/>
-            <wp:effectExtent l="0" t="0" r="5080" b="2540"/>
-            <wp:docPr id="1756493833" name="Picture 1" descr="A screen shot of a computer code&#10;&#10;AI-generated content may be incorrect."/>
+          <wp:inline distT="0" distB="0" distL="0" distR="0" wp14:anchorId="47F3D1F3" wp14:editId="6416B66D">
+            <wp:extent cx="5113900" cy="2276669"/>
+            <wp:effectExtent l="0" t="0" r="4445" b="0"/>
+            <wp:docPr id="1485654187" name="Picture 3" descr="A computer screen with text on it&#10;&#10;AI-generated content may be incorrect."/>
             <wp:cNvGraphicFramePr>
               <a:graphicFrameLocks xmlns:a="http://schemas.openxmlformats.org/drawingml/2006/main" noChangeAspect="1"/>
             </wp:cNvGraphicFramePr>
@@ -246,7 +247,7 @@
               <a:graphicData uri="http://schemas.openxmlformats.org/drawingml/2006/picture">
                 <pic:pic xmlns:pic="http://schemas.openxmlformats.org/drawingml/2006/picture">
                   <pic:nvPicPr>
-                    <pic:cNvPr id="1756493833" name="Picture 1" descr="A screen shot of a computer code&#10;&#10;AI-generated content may be incorrect."/>
+                    <pic:cNvPr id="1485654187" name="Picture 3" descr="A computer screen with text on it&#10;&#10;AI-generated content may be incorrect."/>
                     <pic:cNvPicPr/>
                   </pic:nvPicPr>
                   <pic:blipFill>
@@ -264,7 +265,7 @@
                   <pic:spPr>
                     <a:xfrm>
                       <a:off x="0" y="0"/>
-                      <a:ext cx="4746562" cy="1412306"/>
+                      <a:ext cx="5476774" cy="2438218"/>
                     </a:xfrm>
                     <a:prstGeom prst="rect">
                       <a:avLst/>
@@ -282,7 +283,6 @@
         <w:ind w:left="360"/>
       </w:pPr>
       <w:r>
-        <w:lastRenderedPageBreak/>
         <w:t xml:space="preserve">The is the snippet demonstrating how I address the JSON parsing. I dynamically extract the price for each coin in the loop by passing </w:t>
       </w:r>
       <w:proofErr w:type="spellStart"/>
@@ -485,10 +485,11 @@
           <w:bCs/>
           <w:noProof/>
         </w:rPr>
+        <w:lastRenderedPageBreak/>
         <w:drawing>
-          <wp:inline distT="0" distB="0" distL="0" distR="0" wp14:anchorId="1EEC05F2" wp14:editId="4F434F6E">
-            <wp:extent cx="3096126" cy="1859028"/>
-            <wp:effectExtent l="0" t="0" r="3175" b="0"/>
+          <wp:inline distT="0" distB="0" distL="0" distR="0" wp14:anchorId="1EEC05F2" wp14:editId="6716786C">
+            <wp:extent cx="3418736" cy="2052735"/>
+            <wp:effectExtent l="0" t="0" r="0" b="5080"/>
             <wp:docPr id="2072308502" name="Picture 2" descr="A computer screen shot of text&#10;&#10;AI-generated content may be incorrect."/>
             <wp:cNvGraphicFramePr>
               <a:graphicFrameLocks xmlns:a="http://schemas.openxmlformats.org/drawingml/2006/main" noChangeAspect="1"/>
@@ -515,7 +516,7 @@
                   <pic:spPr>
                     <a:xfrm>
                       <a:off x="0" y="0"/>
-                      <a:ext cx="3124460" cy="1876041"/>
+                      <a:ext cx="3467627" cy="2082091"/>
                     </a:xfrm>
                     <a:prstGeom prst="rect">
                       <a:avLst/>
@@ -547,12 +548,34 @@
     <w:p>
       <w:pPr>
         <w:ind w:left="420"/>
-      </w:pPr>
+        <w:rPr>
+          <w:b/>
+          <w:bCs/>
+        </w:rPr>
+      </w:pPr>
+      <w:r>
+        <w:rPr>
+          <w:b/>
+          <w:bCs/>
+        </w:rPr>
+        <w:t>Database Interaction</w:t>
+      </w:r>
     </w:p>
     <w:p>
       <w:pPr>
         <w:ind w:left="420"/>
       </w:pPr>
+      <w:r>
+        <w:t xml:space="preserve">I developed another function titled </w:t>
+      </w:r>
+      <w:proofErr w:type="spellStart"/>
+      <w:r>
+        <w:t>run_sql</w:t>
+      </w:r>
+      <w:proofErr w:type="spellEnd"/>
+      <w:r>
+        <w:t>, responsible for running all commands in the database. However, upon testing the function, I observed that MySQL warnings such as "Using a password on the command line interface." in MySQL were messing up the assignments in my variables. I altered this by including 2&gt;/dev/null in the function to eliminate those warnings and have only data retrieved back in my script.</w:t>
+      </w:r>
     </w:p>
     <w:p>
       <w:pPr>
@@ -566,46 +589,13 @@
         <w:rPr>
           <w:b/>
           <w:bCs/>
-        </w:rPr>
-        <w:lastRenderedPageBreak/>
-        <w:t>Database Interaction</w:t>
-      </w:r>
-    </w:p>
-    <w:p>
-      <w:pPr>
-        <w:ind w:left="420"/>
-      </w:pPr>
-      <w:r>
-        <w:t xml:space="preserve">I developed another function titled </w:t>
-      </w:r>
-      <w:proofErr w:type="spellStart"/>
-      <w:r>
-        <w:t>run_sql</w:t>
-      </w:r>
-      <w:proofErr w:type="spellEnd"/>
-      <w:r>
-        <w:t>, responsible for running all commands in the database. However, upon testing the function, I observed that MySQL warnings such as "Using a password on the command line interface." in MySQL were messing up the assignments in my variables. I altered this by including 2&gt;/dev/null in the function to eliminate those warnings and have only data retrieved back in my script.</w:t>
-      </w:r>
-    </w:p>
-    <w:p>
-      <w:pPr>
-        <w:ind w:left="420"/>
-        <w:rPr>
-          <w:b/>
-          <w:bCs/>
-        </w:rPr>
-      </w:pPr>
-      <w:r>
-        <w:rPr>
-          <w:b/>
-          <w:bCs/>
           <w:noProof/>
         </w:rPr>
         <w:drawing>
-          <wp:inline distT="0" distB="0" distL="0" distR="0" wp14:anchorId="7B9D7FAA" wp14:editId="343EA506">
-            <wp:extent cx="4045528" cy="1954042"/>
-            <wp:effectExtent l="0" t="0" r="6350" b="1905"/>
-            <wp:docPr id="1875617935" name="Picture 4" descr="A screenshot of a computer program&#10;&#10;AI-generated content may be incorrect."/>
+          <wp:inline distT="0" distB="0" distL="0" distR="0" wp14:anchorId="5B1844F7" wp14:editId="4BC06CC7">
+            <wp:extent cx="4912820" cy="2258008"/>
+            <wp:effectExtent l="0" t="0" r="2540" b="3175"/>
+            <wp:docPr id="1013977122" name="Picture 4" descr="A computer screen with text on it&#10;&#10;AI-generated content may be incorrect."/>
             <wp:cNvGraphicFramePr>
               <a:graphicFrameLocks xmlns:a="http://schemas.openxmlformats.org/drawingml/2006/main" noChangeAspect="1"/>
             </wp:cNvGraphicFramePr>
@@ -613,7 +603,7 @@
               <a:graphicData uri="http://schemas.openxmlformats.org/drawingml/2006/picture">
                 <pic:pic xmlns:pic="http://schemas.openxmlformats.org/drawingml/2006/picture">
                   <pic:nvPicPr>
-                    <pic:cNvPr id="1875617935" name="Picture 4" descr="A screenshot of a computer program&#10;&#10;AI-generated content may be incorrect."/>
+                    <pic:cNvPr id="1013977122" name="Picture 4" descr="A computer screen with text on it&#10;&#10;AI-generated content may be incorrect."/>
                     <pic:cNvPicPr/>
                   </pic:nvPicPr>
                   <pic:blipFill>
@@ -631,7 +621,7 @@
                   <pic:spPr>
                     <a:xfrm>
                       <a:off x="0" y="0"/>
-                      <a:ext cx="4091252" cy="1976127"/>
+                      <a:ext cx="4950115" cy="2275149"/>
                     </a:xfrm>
                     <a:prstGeom prst="rect">
                       <a:avLst/>
@@ -681,6 +671,7 @@
           <w:sz w:val="30"/>
           <w:szCs w:val="30"/>
         </w:rPr>
+        <w:lastRenderedPageBreak/>
         <w:t>MySQL Storage Database</w:t>
       </w:r>
     </w:p>
@@ -722,7 +713,21 @@
         <w:t>I designed</w:t>
       </w:r>
       <w:r>
-        <w:t xml:space="preserve"> a single-table schema focused on time-series cryptocurrency data. The Entity-Relationship Diagram (ERD) below illustrates the core entity and its relationships(keys):</w:t>
+        <w:t xml:space="preserve"> </w:t>
+      </w:r>
+      <w:r>
+        <w:t xml:space="preserve">three </w:t>
+      </w:r>
+      <w:r>
+        <w:t xml:space="preserve">table </w:t>
+      </w:r>
+      <w:proofErr w:type="gramStart"/>
+      <w:r>
+        <w:t>schema</w:t>
+      </w:r>
+      <w:proofErr w:type="gramEnd"/>
+      <w:r>
+        <w:t xml:space="preserve"> focused on time-series cryptocurrency data. The Entity-Relationship Diagram (ERD) below illustrates the core entity and its relationships(keys):</w:t>
       </w:r>
     </w:p>
     <w:p>
@@ -734,10 +739,10 @@
           <w:noProof/>
         </w:rPr>
         <w:drawing>
-          <wp:inline distT="0" distB="0" distL="0" distR="0" wp14:anchorId="614B00A6" wp14:editId="4DAAF87A">
-            <wp:extent cx="1803178" cy="1678305"/>
-            <wp:effectExtent l="0" t="0" r="635" b="0"/>
-            <wp:docPr id="821731643" name="Picture 10" descr="A screen shot of a data&#10;&#10;AI-generated content may be incorrect."/>
+          <wp:inline distT="0" distB="0" distL="0" distR="0" wp14:anchorId="1FA29CD8" wp14:editId="619D3566">
+            <wp:extent cx="1838131" cy="1938483"/>
+            <wp:effectExtent l="0" t="0" r="3810" b="5080"/>
+            <wp:docPr id="646440355" name="Picture 2" descr="A screenshot of a computer&#10;&#10;AI-generated content may be incorrect."/>
             <wp:cNvGraphicFramePr>
               <a:graphicFrameLocks xmlns:a="http://schemas.openxmlformats.org/drawingml/2006/main" noChangeAspect="1"/>
             </wp:cNvGraphicFramePr>
@@ -745,7 +750,7 @@
               <a:graphicData uri="http://schemas.openxmlformats.org/drawingml/2006/picture">
                 <pic:pic xmlns:pic="http://schemas.openxmlformats.org/drawingml/2006/picture">
                   <pic:nvPicPr>
-                    <pic:cNvPr id="821731643" name="Picture 10" descr="A screen shot of a data&#10;&#10;AI-generated content may be incorrect."/>
+                    <pic:cNvPr id="646440355" name="Picture 2" descr="A screenshot of a computer&#10;&#10;AI-generated content may be incorrect."/>
                     <pic:cNvPicPr/>
                   </pic:nvPicPr>
                   <pic:blipFill>
@@ -763,7 +768,7 @@
                   <pic:spPr>
                     <a:xfrm>
                       <a:off x="0" y="0"/>
-                      <a:ext cx="1855587" cy="1727085"/>
+                      <a:ext cx="1946656" cy="2052933"/>
                     </a:xfrm>
                     <a:prstGeom prst="rect">
                       <a:avLst/>
@@ -779,6 +784,153 @@
     <w:p>
       <w:pPr>
         <w:ind w:left="360"/>
+      </w:pPr>
+      <w:r>
+        <w:rPr>
+          <w:b/>
+          <w:bCs/>
+        </w:rPr>
+        <w:t>Coins:</w:t>
+      </w:r>
+      <w:r>
+        <w:t xml:space="preserve"> Stores static metadata like the symbol (</w:t>
+      </w:r>
+      <w:proofErr w:type="spellStart"/>
+      <w:r>
+        <w:t>eg.</w:t>
+      </w:r>
+      <w:proofErr w:type="spellEnd"/>
+      <w:r>
+        <w:t xml:space="preserve"> BTC) and the </w:t>
+      </w:r>
+      <w:proofErr w:type="spellStart"/>
+      <w:r>
+        <w:t>coingecko_id</w:t>
+      </w:r>
+      <w:proofErr w:type="spellEnd"/>
+      <w:r>
+        <w:t xml:space="preserve"> (</w:t>
+      </w:r>
+      <w:proofErr w:type="spellStart"/>
+      <w:r>
+        <w:t>eg.</w:t>
+      </w:r>
+      <w:proofErr w:type="spellEnd"/>
+      <w:r>
+        <w:t xml:space="preserve"> Bitcoin). The </w:t>
+      </w:r>
+      <w:proofErr w:type="spellStart"/>
+      <w:r>
+        <w:t>coin_id</w:t>
+      </w:r>
+      <w:proofErr w:type="spellEnd"/>
+      <w:r>
+        <w:t xml:space="preserve"> is the Primary Key.</w:t>
+      </w:r>
+    </w:p>
+    <w:p>
+      <w:pPr>
+        <w:ind w:left="360"/>
+      </w:pPr>
+      <w:proofErr w:type="spellStart"/>
+      <w:r>
+        <w:rPr>
+          <w:b/>
+          <w:bCs/>
+        </w:rPr>
+        <w:t>data_h</w:t>
+      </w:r>
+      <w:r>
+        <w:rPr>
+          <w:b/>
+          <w:bCs/>
+        </w:rPr>
+        <w:t>i</w:t>
+      </w:r>
+      <w:r>
+        <w:rPr>
+          <w:b/>
+          <w:bCs/>
+        </w:rPr>
+        <w:t>story</w:t>
+      </w:r>
+      <w:proofErr w:type="spellEnd"/>
+      <w:r>
+        <w:rPr>
+          <w:b/>
+          <w:bCs/>
+        </w:rPr>
+        <w:t>:</w:t>
+      </w:r>
+      <w:r>
+        <w:t xml:space="preserve"> </w:t>
+      </w:r>
+      <w:r>
+        <w:t xml:space="preserve">Stores all time-series data, including price, </w:t>
+      </w:r>
+      <w:proofErr w:type="spellStart"/>
+      <w:r>
+        <w:t>change_percent</w:t>
+      </w:r>
+      <w:proofErr w:type="spellEnd"/>
+      <w:r>
+        <w:t>, and moving _average. It links back to the coins table via a Foreign Key (</w:t>
+      </w:r>
+      <w:proofErr w:type="spellStart"/>
+      <w:r>
+        <w:t>coin_id</w:t>
+      </w:r>
+      <w:proofErr w:type="spellEnd"/>
+      <w:r>
+        <w:t>), replacing the need to store the symbol repeatedly for every record.</w:t>
+      </w:r>
+    </w:p>
+    <w:p>
+      <w:pPr>
+        <w:ind w:left="360"/>
+      </w:pPr>
+      <w:proofErr w:type="spellStart"/>
+      <w:r>
+        <w:rPr>
+          <w:b/>
+          <w:bCs/>
+        </w:rPr>
+        <w:t>collection_runs</w:t>
+      </w:r>
+      <w:proofErr w:type="spellEnd"/>
+      <w:r>
+        <w:rPr>
+          <w:b/>
+          <w:bCs/>
+        </w:rPr>
+        <w:t>:</w:t>
+      </w:r>
+      <w:r>
+        <w:t xml:space="preserve"> </w:t>
+      </w:r>
+      <w:r>
+        <w:t xml:space="preserve">Logs the </w:t>
+      </w:r>
+      <w:proofErr w:type="spellStart"/>
+      <w:r>
+        <w:t>start_time</w:t>
+      </w:r>
+      <w:proofErr w:type="spellEnd"/>
+      <w:r>
+        <w:t xml:space="preserve"> and </w:t>
+      </w:r>
+      <w:proofErr w:type="spellStart"/>
+      <w:r>
+        <w:t>total_records_inserted</w:t>
+      </w:r>
+      <w:proofErr w:type="spellEnd"/>
+      <w:r>
+        <w:t xml:space="preserve"> for each successful tracker.sh execution.</w:t>
+      </w:r>
+    </w:p>
+    <w:p>
+      <w:pPr>
+        <w:ind w:left="360"/>
         <w:rPr>
           <w:b/>
           <w:bCs/>
@@ -787,191 +939,14 @@
         </w:rPr>
       </w:pPr>
       <w:r>
-        <w:lastRenderedPageBreak/>
-        <w:t xml:space="preserve">I have developed a database named </w:t>
-      </w:r>
-      <w:proofErr w:type="spellStart"/>
-      <w:r>
-        <w:t>stock_tracker</w:t>
-      </w:r>
-      <w:proofErr w:type="spellEnd"/>
-      <w:r>
-        <w:t xml:space="preserve"> with only one table named </w:t>
-      </w:r>
-      <w:proofErr w:type="spellStart"/>
-      <w:r>
-        <w:t>stock_data</w:t>
-      </w:r>
-      <w:proofErr w:type="spellEnd"/>
-      <w:r>
-        <w:t>.</w:t>
-      </w:r>
-    </w:p>
-    <w:p>
-      <w:pPr>
-        <w:ind w:left="360"/>
-        <w:rPr>
-          <w:b/>
-          <w:bCs/>
-          <w:sz w:val="30"/>
-          <w:szCs w:val="30"/>
-        </w:rPr>
-      </w:pPr>
-      <w:r>
-        <w:rPr>
-          <w:b/>
-          <w:bCs/>
-        </w:rPr>
-        <w:t xml:space="preserve">price &amp; </w:t>
-      </w:r>
-      <w:proofErr w:type="spellStart"/>
-      <w:r>
-        <w:rPr>
-          <w:b/>
-          <w:bCs/>
-        </w:rPr>
-        <w:t>moving_average</w:t>
-      </w:r>
-      <w:proofErr w:type="spellEnd"/>
-      <w:r>
-        <w:rPr>
-          <w:b/>
-          <w:bCs/>
-        </w:rPr>
-        <w:t>:</w:t>
-      </w:r>
-      <w:r>
-        <w:t xml:space="preserve"> The data type in this column is </w:t>
-      </w:r>
-      <w:proofErr w:type="gramStart"/>
-      <w:r>
-        <w:t>DECIMAL(</w:t>
-      </w:r>
-      <w:proofErr w:type="gramEnd"/>
-      <w:r>
-        <w:t xml:space="preserve">15, 6). The reason I chose DECIMAL </w:t>
-      </w:r>
-      <w:r>
-        <w:t>over FLOAT</w:t>
-      </w:r>
-      <w:r>
-        <w:t xml:space="preserve"> data type here is that this data type eradicates rounding errors. According to MySQL documentation, rounding errors are common </w:t>
-      </w:r>
-      <w:r>
-        <w:t>in FLOAT</w:t>
-      </w:r>
-    </w:p>
-    <w:p>
-      <w:pPr>
-        <w:ind w:left="360"/>
-        <w:rPr>
-          <w:b/>
-          <w:bCs/>
-          <w:sz w:val="30"/>
-          <w:szCs w:val="30"/>
-        </w:rPr>
-      </w:pPr>
-      <w:proofErr w:type="spellStart"/>
-      <w:r>
-        <w:rPr>
-          <w:b/>
-          <w:bCs/>
-        </w:rPr>
-        <w:t>moving_average</w:t>
-      </w:r>
-      <w:proofErr w:type="spellEnd"/>
-      <w:r>
-        <w:rPr>
-          <w:b/>
-          <w:bCs/>
-        </w:rPr>
-        <w:t>:</w:t>
-      </w:r>
-      <w:r>
-        <w:t xml:space="preserve"> This column function will allow NULL values. This needs to be done since not all coins' first few records are going to be calculated with the moving average yet.</w:t>
-      </w:r>
-    </w:p>
-    <w:p>
-      <w:pPr>
-        <w:ind w:left="360"/>
-        <w:rPr>
-          <w:b/>
-          <w:bCs/>
-          <w:sz w:val="30"/>
-          <w:szCs w:val="30"/>
-        </w:rPr>
-      </w:pPr>
-      <w:proofErr w:type="spellStart"/>
-      <w:r>
-        <w:rPr>
-          <w:b/>
-          <w:bCs/>
-        </w:rPr>
-        <w:t>data_recorded</w:t>
-      </w:r>
-      <w:proofErr w:type="spellEnd"/>
-      <w:r>
-        <w:rPr>
-          <w:b/>
-          <w:bCs/>
-        </w:rPr>
-        <w:t>:</w:t>
-      </w:r>
-      <w:r>
-        <w:t xml:space="preserve"> This function always defaults to ‘CURRENT_TIMESTAMP’</w:t>
-      </w:r>
-      <w:r>
-        <w:t>. H</w:t>
-      </w:r>
-      <w:r>
-        <w:t xml:space="preserve">ence, </w:t>
-      </w:r>
-      <w:r>
-        <w:t>I do not</w:t>
-      </w:r>
-      <w:r>
-        <w:t xml:space="preserve"> need to create this in the script.</w:t>
-      </w:r>
-    </w:p>
-    <w:p>
-      <w:pPr>
-        <w:ind w:left="360"/>
-      </w:pPr>
-      <w:r>
-        <w:t xml:space="preserve">I also added a UNIQUE constraint in the pair (symbol, </w:t>
-      </w:r>
-      <w:proofErr w:type="spellStart"/>
-      <w:r>
-        <w:t>date_recorded</w:t>
-      </w:r>
-      <w:proofErr w:type="spellEnd"/>
-      <w:r>
-        <w:t>) in case this script gets accidentally run twice; this would prevent duplication of information.</w:t>
-      </w:r>
-    </w:p>
-    <w:p>
-      <w:pPr>
-        <w:ind w:left="360"/>
-        <w:rPr>
-          <w:b/>
-          <w:bCs/>
-          <w:sz w:val="30"/>
-          <w:szCs w:val="30"/>
-        </w:rPr>
-      </w:pPr>
-      <w:r>
-        <w:rPr>
-          <w:b/>
-          <w:bCs/>
+        <w:rPr>
           <w:noProof/>
-          <w:sz w:val="30"/>
-          <w:szCs w:val="30"/>
         </w:rPr>
         <w:drawing>
-          <wp:inline distT="0" distB="0" distL="0" distR="0" wp14:anchorId="23F63933" wp14:editId="6C6503AB">
-            <wp:extent cx="4618827" cy="1240077"/>
-            <wp:effectExtent l="0" t="0" r="4445" b="5080"/>
-            <wp:docPr id="160626010" name="Picture 5" descr="A computer screen shot of a black background&#10;&#10;AI-generated content may be incorrect."/>
+          <wp:inline distT="0" distB="0" distL="0" distR="0" wp14:anchorId="1F8B9395" wp14:editId="0E2565D6">
+            <wp:extent cx="2519091" cy="2565919"/>
+            <wp:effectExtent l="0" t="0" r="0" b="0"/>
+            <wp:docPr id="1444055965" name="Picture 1"/>
             <wp:cNvGraphicFramePr>
               <a:graphicFrameLocks xmlns:a="http://schemas.openxmlformats.org/drawingml/2006/main" noChangeAspect="1"/>
             </wp:cNvGraphicFramePr>
@@ -979,11 +954,11 @@
               <a:graphicData uri="http://schemas.openxmlformats.org/drawingml/2006/picture">
                 <pic:pic xmlns:pic="http://schemas.openxmlformats.org/drawingml/2006/picture">
                   <pic:nvPicPr>
-                    <pic:cNvPr id="160626010" name="Picture 5" descr="A computer screen shot of a black background&#10;&#10;AI-generated content may be incorrect."/>
+                    <pic:cNvPr id="1444055965" name="Picture 1444055965"/>
                     <pic:cNvPicPr/>
                   </pic:nvPicPr>
                   <pic:blipFill>
-                    <a:blip r:embed="rId9">
+                    <a:blip r:embed="rId9" cstate="print">
                       <a:extLst>
                         <a:ext uri="{28A0092B-C50C-407E-A947-70E740481C1C}">
                           <a14:useLocalDpi xmlns:a14="http://schemas.microsoft.com/office/drawing/2010/main" val="0"/>
@@ -997,7 +972,7 @@
                   <pic:spPr>
                     <a:xfrm>
                       <a:off x="0" y="0"/>
-                      <a:ext cx="4701342" cy="1262231"/>
+                      <a:ext cx="2628218" cy="2677074"/>
                     </a:xfrm>
                     <a:prstGeom prst="rect">
                       <a:avLst/>
@@ -1015,6 +990,7 @@
         <w:ind w:left="360"/>
       </w:pPr>
       <w:r>
+        <w:lastRenderedPageBreak/>
         <w:t xml:space="preserve">The SQL structure shows the use of </w:t>
       </w:r>
       <w:proofErr w:type="gramStart"/>
@@ -1031,10 +1007,21 @@
       </w:r>
       <w:proofErr w:type="spellEnd"/>
       <w:r>
-        <w:t xml:space="preserve"> precision. I also added a UNIQUE KEY constraint on symbol and </w:t>
+        <w:t xml:space="preserve"> precision. I also added a UNIQUE KEY constraint on </w:t>
       </w:r>
       <w:proofErr w:type="spellStart"/>
       <w:r>
+        <w:t>coin_id</w:t>
+      </w:r>
+      <w:proofErr w:type="spellEnd"/>
+      <w:r>
+        <w:t xml:space="preserve"> </w:t>
+      </w:r>
+      <w:r>
+        <w:t xml:space="preserve">and </w:t>
+      </w:r>
+      <w:proofErr w:type="spellStart"/>
+      <w:r>
         <w:t>date_recorded</w:t>
       </w:r>
       <w:proofErr w:type="spellEnd"/>
@@ -1067,33 +1054,252 @@
     </w:p>
     <w:p>
       <w:pPr>
+        <w:pStyle w:val="ListParagraph"/>
+        <w:numPr>
+          <w:ilvl w:val="0"/>
+          <w:numId w:val="1"/>
+        </w:numPr>
+        <w:rPr>
+          <w:b/>
+          <w:bCs/>
+          <w:sz w:val="30"/>
+          <w:szCs w:val="30"/>
+        </w:rPr>
+      </w:pPr>
+      <w:r>
+        <w:rPr>
+          <w:b/>
+          <w:bCs/>
+          <w:sz w:val="30"/>
+          <w:szCs w:val="30"/>
+        </w:rPr>
+        <w:t>Visualizing the Data (plotter</w:t>
+      </w:r>
+      <w:r>
+        <w:rPr>
+          <w:b/>
+          <w:bCs/>
+          <w:sz w:val="30"/>
+          <w:szCs w:val="30"/>
+        </w:rPr>
+        <w:t>.sh)</w:t>
+      </w:r>
+    </w:p>
+    <w:p>
+      <w:pPr>
         <w:ind w:left="360"/>
-      </w:pPr>
-      <w:r>
-        <w:t xml:space="preserve">Sample Data from </w:t>
+        <w:rPr>
+          <w:b/>
+          <w:bCs/>
+          <w:sz w:val="30"/>
+          <w:szCs w:val="30"/>
+        </w:rPr>
+      </w:pPr>
+      <w:r>
+        <w:t xml:space="preserve">To be able to use the data gathered in this project, I developed the plotter.sh script. The choice of </w:t>
       </w:r>
       <w:proofErr w:type="spellStart"/>
       <w:r>
-        <w:t>stock_data</w:t>
+        <w:t>Ginuplot</w:t>
       </w:r>
       <w:proofErr w:type="spellEnd"/>
       <w:r>
-        <w:t xml:space="preserve"> Table (Latest 5 Entries)</w:t>
+        <w:t xml:space="preserve"> in this project was </w:t>
+      </w:r>
+      <w:proofErr w:type="gramStart"/>
+      <w:r>
+        <w:t>based on the fact that</w:t>
+      </w:r>
+      <w:proofErr w:type="gramEnd"/>
+      <w:r>
+        <w:t xml:space="preserve"> this tool can be scripted entirely from the command line interface. This renders it ideal for this project.</w:t>
       </w:r>
     </w:p>
     <w:p>
       <w:pPr>
         <w:ind w:left="360"/>
-      </w:pPr>
-      <w:r>
-        <w:rPr>
+        <w:rPr>
+          <w:b/>
+          <w:bCs/>
+          <w:sz w:val="30"/>
+          <w:szCs w:val="30"/>
+        </w:rPr>
+      </w:pPr>
+      <w:r>
+        <w:rPr>
+          <w:b/>
+          <w:bCs/>
+        </w:rPr>
+        <w:t>Data Formatting</w:t>
+      </w:r>
+    </w:p>
+    <w:p>
+      <w:pPr>
+        <w:ind w:left="360"/>
+        <w:rPr>
+          <w:b/>
+          <w:bCs/>
+          <w:sz w:val="30"/>
+          <w:szCs w:val="30"/>
+        </w:rPr>
+      </w:pPr>
+      <w:proofErr w:type="spellStart"/>
+      <w:r>
+        <w:t>Gnuplot</w:t>
+      </w:r>
+      <w:proofErr w:type="spellEnd"/>
+      <w:r>
+        <w:t xml:space="preserve"> has strict requirements concerning data format. For data extraction from the MySQL database into this temporary file (temp_plot_data.dat), I wrote this query: However, the major issue encountered in this project is that MySQL data often has hidden </w:t>
+      </w:r>
+      <w:r>
+        <w:t>(</w:t>
+      </w:r>
+      <w:r>
+        <w:t>\r</w:t>
+      </w:r>
+      <w:r>
+        <w:t>)</w:t>
+      </w:r>
+      <w:r>
+        <w:t xml:space="preserve"> carriage return symbols that cause </w:t>
+      </w:r>
+      <w:proofErr w:type="spellStart"/>
+      <w:r>
+        <w:t>G</w:t>
+      </w:r>
+      <w:r>
+        <w:t>nuplot</w:t>
+      </w:r>
+      <w:proofErr w:type="spellEnd"/>
+      <w:r>
+        <w:t xml:space="preserve"> data rendering problems. The issue has been resolved using tr -d '\r'.</w:t>
+      </w:r>
+    </w:p>
+    <w:p>
+      <w:pPr>
+        <w:ind w:left="360"/>
+        <w:rPr>
+          <w:b/>
+          <w:bCs/>
+          <w:sz w:val="30"/>
+          <w:szCs w:val="30"/>
+        </w:rPr>
+      </w:pPr>
+      <w:r>
+        <w:rPr>
+          <w:b/>
+          <w:bCs/>
+        </w:rPr>
+        <w:t>The Graphs</w:t>
+      </w:r>
+    </w:p>
+    <w:p>
+      <w:pPr>
+        <w:ind w:left="360"/>
+        <w:rPr>
+          <w:b/>
+          <w:bCs/>
+          <w:sz w:val="30"/>
+          <w:szCs w:val="30"/>
+        </w:rPr>
+      </w:pPr>
+      <w:r>
+        <w:t>The script produces the PNG image file based on the symbol passed (</w:t>
+      </w:r>
+      <w:r>
+        <w:t>e.g.</w:t>
+      </w:r>
+      <w:proofErr w:type="gramStart"/>
+      <w:r>
+        <w:t xml:space="preserve">, </w:t>
+      </w:r>
+      <w:r>
+        <w:t xml:space="preserve"> ./plotter.sh</w:t>
+      </w:r>
+      <w:proofErr w:type="gramEnd"/>
+      <w:r>
+        <w:t xml:space="preserve"> BTC). The lines in this graph are:</w:t>
+      </w:r>
+    </w:p>
+    <w:p>
+      <w:pPr>
+        <w:pStyle w:val="ListParagraph"/>
+        <w:numPr>
+          <w:ilvl w:val="0"/>
+          <w:numId w:val="4"/>
+        </w:numPr>
+        <w:rPr>
+          <w:b/>
+          <w:bCs/>
+        </w:rPr>
+      </w:pPr>
+      <w:r>
+        <w:rPr>
+          <w:b/>
+          <w:bCs/>
+        </w:rPr>
+        <w:t>The Price:</w:t>
+      </w:r>
+      <w:r>
+        <w:t xml:space="preserve"> </w:t>
+      </w:r>
+      <w:r>
+        <w:t>Shown with points and lines.</w:t>
+      </w:r>
+    </w:p>
+    <w:p>
+      <w:pPr>
+        <w:pStyle w:val="ListParagraph"/>
+        <w:numPr>
+          <w:ilvl w:val="0"/>
+          <w:numId w:val="4"/>
+        </w:numPr>
+        <w:rPr>
+          <w:b/>
+          <w:bCs/>
+        </w:rPr>
+      </w:pPr>
+      <w:r>
+        <w:rPr>
+          <w:b/>
+          <w:bCs/>
+        </w:rPr>
+        <w:t>The Moving Average:</w:t>
+      </w:r>
+      <w:r>
+        <w:t xml:space="preserve"> </w:t>
+      </w:r>
+      <w:r>
+        <w:t xml:space="preserve">A smoothed line plotted atop the price charts </w:t>
+      </w:r>
+      <w:proofErr w:type="gramStart"/>
+      <w:r>
+        <w:t>in order to</w:t>
+      </w:r>
+      <w:proofErr w:type="gramEnd"/>
+      <w:r>
+        <w:t xml:space="preserve"> reveal the trend.</w:t>
+      </w:r>
+    </w:p>
+    <w:p>
+      <w:pPr>
+        <w:ind w:left="420"/>
+        <w:rPr>
+          <w:b/>
+          <w:bCs/>
+        </w:rPr>
+      </w:pPr>
+      <w:r>
+        <w:rPr>
+          <w:b/>
+          <w:bCs/>
           <w:noProof/>
         </w:rPr>
         <w:drawing>
-          <wp:inline distT="0" distB="0" distL="0" distR="0" wp14:anchorId="0C3F9A09" wp14:editId="1F09A356">
-            <wp:extent cx="5073042" cy="1225985"/>
-            <wp:effectExtent l="0" t="0" r="0" b="6350"/>
-            <wp:docPr id="885983237" name="Picture 9" descr="A screen shot of a black and white screen&#10;&#10;AI-generated content may be incorrect."/>
+          <wp:inline distT="0" distB="0" distL="0" distR="0" wp14:anchorId="7538ED5B" wp14:editId="65CD4037">
+            <wp:extent cx="3862873" cy="1856325"/>
+            <wp:effectExtent l="0" t="0" r="0" b="0"/>
+            <wp:docPr id="324056811" name="Picture 6" descr="A screenshot of a computer program&#10;&#10;AI-generated content may be incorrect."/>
             <wp:cNvGraphicFramePr>
               <a:graphicFrameLocks xmlns:a="http://schemas.openxmlformats.org/drawingml/2006/main" noChangeAspect="1"/>
             </wp:cNvGraphicFramePr>
@@ -1101,7 +1307,7 @@
               <a:graphicData uri="http://schemas.openxmlformats.org/drawingml/2006/picture">
                 <pic:pic xmlns:pic="http://schemas.openxmlformats.org/drawingml/2006/picture">
                   <pic:nvPicPr>
-                    <pic:cNvPr id="885983237" name="Picture 9" descr="A screen shot of a black and white screen&#10;&#10;AI-generated content may be incorrect."/>
+                    <pic:cNvPr id="324056811" name="Picture 6" descr="A screenshot of a computer program&#10;&#10;AI-generated content may be incorrect."/>
                     <pic:cNvPicPr/>
                   </pic:nvPicPr>
                   <pic:blipFill>
@@ -1119,7 +1325,7 @@
                   <pic:spPr>
                     <a:xfrm>
                       <a:off x="0" y="0"/>
-                      <a:ext cx="5135162" cy="1240997"/>
+                      <a:ext cx="4025539" cy="1934495"/>
                     </a:xfrm>
                     <a:prstGeom prst="rect">
                       <a:avLst/>
@@ -1134,253 +1340,26 @@
     </w:p>
     <w:p>
       <w:pPr>
-        <w:pStyle w:val="ListParagraph"/>
-        <w:numPr>
-          <w:ilvl w:val="0"/>
-          <w:numId w:val="1"/>
-        </w:numPr>
-        <w:rPr>
-          <w:b/>
-          <w:bCs/>
-          <w:sz w:val="30"/>
-          <w:szCs w:val="30"/>
-        </w:rPr>
-      </w:pPr>
-      <w:r>
-        <w:rPr>
-          <w:b/>
-          <w:bCs/>
-          <w:sz w:val="30"/>
-          <w:szCs w:val="30"/>
-        </w:rPr>
-        <w:t>Visualizing the Data (plotter</w:t>
-      </w:r>
-      <w:r>
-        <w:rPr>
-          <w:b/>
-          <w:bCs/>
-          <w:sz w:val="30"/>
-          <w:szCs w:val="30"/>
-        </w:rPr>
-        <w:t>.sh)</w:t>
-      </w:r>
-    </w:p>
-    <w:p>
-      <w:pPr>
-        <w:ind w:left="360"/>
-        <w:rPr>
-          <w:b/>
-          <w:bCs/>
-          <w:sz w:val="30"/>
-          <w:szCs w:val="30"/>
-        </w:rPr>
-      </w:pPr>
-      <w:r>
-        <w:t xml:space="preserve">To be able to use the data gathered in this project, I developed the plotter.sh script. The choice of </w:t>
-      </w:r>
-      <w:proofErr w:type="spellStart"/>
-      <w:r>
-        <w:t>Ginuplot</w:t>
-      </w:r>
-      <w:proofErr w:type="spellEnd"/>
-      <w:r>
-        <w:t xml:space="preserve"> in this project was </w:t>
-      </w:r>
-      <w:proofErr w:type="gramStart"/>
-      <w:r>
-        <w:t>based on the fact that</w:t>
-      </w:r>
-      <w:proofErr w:type="gramEnd"/>
-      <w:r>
-        <w:t xml:space="preserve"> this tool can be scripted entirely from the command line interface. This renders it ideal for this project.</w:t>
-      </w:r>
-    </w:p>
-    <w:p>
-      <w:pPr>
-        <w:ind w:left="360"/>
-        <w:rPr>
-          <w:b/>
-          <w:bCs/>
-          <w:sz w:val="30"/>
-          <w:szCs w:val="30"/>
-        </w:rPr>
-      </w:pPr>
-      <w:r>
-        <w:rPr>
-          <w:b/>
-          <w:bCs/>
+        <w:ind w:left="420"/>
+      </w:pPr>
+      <w:r>
+        <w:t>This ‘Here Document’ block automates the graph generation. I configured the X-axis to interpret raw Unix timestamps (%s) from the database but display them in a human-readable Month/Day format. The plot command draws two distinct series from the same data source: the raw price with points for detail, and the Moving Average with a solid line to visualize the trend.</w:t>
+      </w:r>
+    </w:p>
+    <w:p>
+      <w:pPr>
+        <w:ind w:left="420"/>
+      </w:pPr>
+      <w:r>
+        <w:rPr>
+          <w:noProof/>
         </w:rPr>
         <w:lastRenderedPageBreak/>
-        <w:t>Data Formatting</w:t>
-      </w:r>
-    </w:p>
-    <w:p>
-      <w:pPr>
-        <w:ind w:left="360"/>
-        <w:rPr>
-          <w:b/>
-          <w:bCs/>
-          <w:sz w:val="30"/>
-          <w:szCs w:val="30"/>
-        </w:rPr>
-      </w:pPr>
-      <w:proofErr w:type="spellStart"/>
-      <w:r>
-        <w:t>Gnuplot</w:t>
-      </w:r>
-      <w:proofErr w:type="spellEnd"/>
-      <w:r>
-        <w:t xml:space="preserve"> has strict requirements concerning data format. For data extraction from the MySQL database into this temporary file (temp_plot_data.dat), I wrote this query: However, the major issue encountered in this project is that MySQL data often has hidden </w:t>
-      </w:r>
-      <w:r>
-        <w:t>(</w:t>
-      </w:r>
-      <w:r>
-        <w:t>\r</w:t>
-      </w:r>
-      <w:r>
-        <w:t>)</w:t>
-      </w:r>
-      <w:r>
-        <w:t xml:space="preserve"> carriage return symbols that cause </w:t>
-      </w:r>
-      <w:proofErr w:type="spellStart"/>
-      <w:r>
-        <w:t>G</w:t>
-      </w:r>
-      <w:r>
-        <w:t>nuplot</w:t>
-      </w:r>
-      <w:proofErr w:type="spellEnd"/>
-      <w:r>
-        <w:t xml:space="preserve"> data rendering problems. The issue has been resolved using tr -d '\r'.</w:t>
-      </w:r>
-    </w:p>
-    <w:p>
-      <w:pPr>
-        <w:ind w:left="360"/>
-        <w:rPr>
-          <w:b/>
-          <w:bCs/>
-          <w:sz w:val="30"/>
-          <w:szCs w:val="30"/>
-        </w:rPr>
-      </w:pPr>
-      <w:r>
-        <w:rPr>
-          <w:b/>
-          <w:bCs/>
-        </w:rPr>
-        <w:t>The Graphs</w:t>
-      </w:r>
-    </w:p>
-    <w:p>
-      <w:pPr>
-        <w:ind w:left="360"/>
-        <w:rPr>
-          <w:b/>
-          <w:bCs/>
-          <w:sz w:val="30"/>
-          <w:szCs w:val="30"/>
-        </w:rPr>
-      </w:pPr>
-      <w:r>
-        <w:t>The script produces the PNG image file based on the symbol passed (</w:t>
-      </w:r>
-      <w:r>
-        <w:t>e.g.</w:t>
-      </w:r>
-      <w:proofErr w:type="gramStart"/>
-      <w:r>
-        <w:t xml:space="preserve">, </w:t>
-      </w:r>
-      <w:r>
-        <w:t xml:space="preserve"> ./plotter.sh</w:t>
-      </w:r>
-      <w:proofErr w:type="gramEnd"/>
-      <w:r>
-        <w:t xml:space="preserve"> BTC). The lines in this graph are:</w:t>
-      </w:r>
-    </w:p>
-    <w:p>
-      <w:pPr>
-        <w:pStyle w:val="ListParagraph"/>
-        <w:numPr>
-          <w:ilvl w:val="0"/>
-          <w:numId w:val="4"/>
-        </w:numPr>
-        <w:rPr>
-          <w:b/>
-          <w:bCs/>
-        </w:rPr>
-      </w:pPr>
-      <w:r>
-        <w:rPr>
-          <w:b/>
-          <w:bCs/>
-        </w:rPr>
-        <w:t>The Price:</w:t>
-      </w:r>
-      <w:r>
-        <w:t xml:space="preserve"> </w:t>
-      </w:r>
-      <w:r>
-        <w:t>Shown with points and lines.</w:t>
-      </w:r>
-    </w:p>
-    <w:p>
-      <w:pPr>
-        <w:pStyle w:val="ListParagraph"/>
-        <w:numPr>
-          <w:ilvl w:val="0"/>
-          <w:numId w:val="4"/>
-        </w:numPr>
-        <w:rPr>
-          <w:b/>
-          <w:bCs/>
-        </w:rPr>
-      </w:pPr>
-      <w:r>
-        <w:rPr>
-          <w:b/>
-          <w:bCs/>
-        </w:rPr>
-        <w:t>The Moving Average:</w:t>
-      </w:r>
-      <w:r>
-        <w:t xml:space="preserve"> </w:t>
-      </w:r>
-      <w:r>
-        <w:t xml:space="preserve">A smoothed line plotted atop the price charts </w:t>
-      </w:r>
-      <w:proofErr w:type="gramStart"/>
-      <w:r>
-        <w:t>in order to</w:t>
-      </w:r>
-      <w:proofErr w:type="gramEnd"/>
-      <w:r>
-        <w:t xml:space="preserve"> reveal the trend.</w:t>
-      </w:r>
-    </w:p>
-    <w:p>
-      <w:pPr>
-        <w:ind w:left="420"/>
-        <w:rPr>
-          <w:b/>
-          <w:bCs/>
-        </w:rPr>
-      </w:pPr>
-      <w:r>
-        <w:rPr>
-          <w:b/>
-          <w:bCs/>
-          <w:noProof/>
-        </w:rPr>
         <w:drawing>
-          <wp:inline distT="0" distB="0" distL="0" distR="0" wp14:anchorId="7538ED5B" wp14:editId="2B128709">
-            <wp:extent cx="5074126" cy="2438400"/>
-            <wp:effectExtent l="0" t="0" r="6350" b="0"/>
-            <wp:docPr id="324056811" name="Picture 6" descr="A screenshot of a computer program&#10;&#10;AI-generated content may be incorrect."/>
+          <wp:inline distT="0" distB="0" distL="0" distR="0" wp14:anchorId="47546198" wp14:editId="65616E31">
+            <wp:extent cx="3648269" cy="2736203"/>
+            <wp:effectExtent l="0" t="0" r="0" b="0"/>
+            <wp:docPr id="409500208" name="Picture 8" descr="A graph with green and purple lines&#10;&#10;AI-generated content may be incorrect."/>
             <wp:cNvGraphicFramePr>
               <a:graphicFrameLocks xmlns:a="http://schemas.openxmlformats.org/drawingml/2006/main" noChangeAspect="1"/>
             </wp:cNvGraphicFramePr>
@@ -1388,7 +1367,7 @@
               <a:graphicData uri="http://schemas.openxmlformats.org/drawingml/2006/picture">
                 <pic:pic xmlns:pic="http://schemas.openxmlformats.org/drawingml/2006/picture">
                   <pic:nvPicPr>
-                    <pic:cNvPr id="324056811" name="Picture 6" descr="A screenshot of a computer program&#10;&#10;AI-generated content may be incorrect."/>
+                    <pic:cNvPr id="409500208" name="Picture 8" descr="A graph with green and purple lines&#10;&#10;AI-generated content may be incorrect."/>
                     <pic:cNvPicPr/>
                   </pic:nvPicPr>
                   <pic:blipFill>
@@ -1406,7 +1385,7 @@
                   <pic:spPr>
                     <a:xfrm>
                       <a:off x="0" y="0"/>
-                      <a:ext cx="5200334" cy="2499050"/>
+                      <a:ext cx="3931956" cy="2948968"/>
                     </a:xfrm>
                     <a:prstGeom prst="rect">
                       <a:avLst/>
@@ -1424,23 +1403,136 @@
         <w:ind w:left="420"/>
       </w:pPr>
       <w:r>
-        <w:t>This ‘Here Document’ block automates the graph generation. I configured the X-axis to interpret raw Unix timestamps (%s) from the database but display them in a human-readable Month/Day format. The plot command draws two distinct series from the same data source: the raw price with points for detail, and the Moving Average with a solid line to visualize the trend.</w:t>
-      </w:r>
-    </w:p>
-    <w:p>
-      <w:pPr>
-        <w:ind w:left="420"/>
-      </w:pPr>
-      <w:r>
-        <w:rPr>
+        <w:t xml:space="preserve">To </w:t>
+      </w:r>
+      <w:r>
+        <w:t>save</w:t>
+      </w:r>
+      <w:r>
+        <w:t xml:space="preserve"> time, I also developed another script wrapper named ‘generate_all_plots.sh’ that automatically loops through the entire list of symbols that I have and executes the plotter script for each symbol. </w:t>
+      </w:r>
+    </w:p>
+    <w:p>
+      <w:pPr>
+        <w:pStyle w:val="ListParagraph"/>
+        <w:numPr>
+          <w:ilvl w:val="0"/>
+          <w:numId w:val="1"/>
+        </w:numPr>
+        <w:rPr>
+          <w:b/>
+          <w:bCs/>
+          <w:sz w:val="30"/>
+          <w:szCs w:val="30"/>
+        </w:rPr>
+      </w:pPr>
+      <w:r>
+        <w:rPr>
+          <w:b/>
+          <w:bCs/>
+          <w:sz w:val="30"/>
+          <w:szCs w:val="30"/>
+        </w:rPr>
+        <w:t xml:space="preserve">Version Control (Git) </w:t>
+      </w:r>
+    </w:p>
+    <w:p>
+      <w:pPr>
+        <w:ind w:left="360"/>
+      </w:pPr>
+      <w:r>
+        <w:t xml:space="preserve">Throughout the process of coding, I utilized Git. This was especially helpful in terms of debugging my code in the Moving Average section. </w:t>
+      </w:r>
+    </w:p>
+    <w:p>
+      <w:pPr>
+        <w:pStyle w:val="ListParagraph"/>
+        <w:numPr>
+          <w:ilvl w:val="0"/>
+          <w:numId w:val="5"/>
+        </w:numPr>
+      </w:pPr>
+      <w:r>
+        <w:rPr>
+          <w:b/>
+          <w:bCs/>
+        </w:rPr>
+        <w:t>Commit History:</w:t>
+      </w:r>
+      <w:r>
+        <w:rPr>
+          <w:rFonts w:hint="eastAsia"/>
+          <w:b/>
+          <w:bCs/>
+        </w:rPr>
+        <w:t xml:space="preserve"> </w:t>
+      </w:r>
+      <w:r>
+        <w:t xml:space="preserve">I made commits when I finished </w:t>
+      </w:r>
+      <w:proofErr w:type="gramStart"/>
+      <w:r>
+        <w:t>particular features</w:t>
+      </w:r>
+      <w:proofErr w:type="gramEnd"/>
+      <w:r>
+        <w:t xml:space="preserve"> (such as "</w:t>
+      </w:r>
+      <w:r>
+        <w:t>Creating database</w:t>
+      </w:r>
+      <w:r>
+        <w:t>" or "</w:t>
+      </w:r>
+      <w:r>
+        <w:t>Debug for calculating moving average</w:t>
+      </w:r>
+      <w:r>
+        <w:t xml:space="preserve">"). </w:t>
+      </w:r>
+    </w:p>
+    <w:p>
+      <w:pPr>
+        <w:pStyle w:val="ListParagraph"/>
+        <w:numPr>
+          <w:ilvl w:val="0"/>
+          <w:numId w:val="5"/>
+        </w:numPr>
+        <w:rPr>
+          <w:b/>
+          <w:bCs/>
+        </w:rPr>
+      </w:pPr>
+      <w:r>
+        <w:rPr>
+          <w:b/>
+          <w:bCs/>
+        </w:rPr>
+        <w:t>Error Recovery:</w:t>
+      </w:r>
+      <w:r>
+        <w:t xml:space="preserve"> Once, I broke the database insertion loop. But since I knew I had previously committed my working code, I was able to look through code changes and correct those changes. This allowed me to return my code to the working stage. </w:t>
+      </w:r>
+    </w:p>
+    <w:p>
+      <w:pPr>
+        <w:ind w:left="720"/>
+        <w:rPr>
+          <w:b/>
+          <w:bCs/>
+        </w:rPr>
+      </w:pPr>
+      <w:r>
+        <w:rPr>
+          <w:b/>
+          <w:bCs/>
           <w:noProof/>
         </w:rPr>
-        <w:lastRenderedPageBreak/>
         <w:drawing>
-          <wp:inline distT="0" distB="0" distL="0" distR="0" wp14:anchorId="47546198" wp14:editId="6794AC82">
-            <wp:extent cx="4086808" cy="3065107"/>
-            <wp:effectExtent l="0" t="0" r="3175" b="0"/>
-            <wp:docPr id="409500208" name="Picture 8" descr="A graph with green and purple lines&#10;&#10;AI-generated content may be incorrect."/>
+          <wp:inline distT="0" distB="0" distL="0" distR="0" wp14:anchorId="4A9EA17A" wp14:editId="3EB5F414">
+            <wp:extent cx="4213583" cy="2220686"/>
+            <wp:effectExtent l="0" t="0" r="3175" b="1905"/>
+            <wp:docPr id="1468839607" name="Picture 5" descr="A screenshot of a computer&#10;&#10;AI-generated content may be incorrect."/>
             <wp:cNvGraphicFramePr>
               <a:graphicFrameLocks xmlns:a="http://schemas.openxmlformats.org/drawingml/2006/main" noChangeAspect="1"/>
             </wp:cNvGraphicFramePr>
@@ -1448,11 +1540,11 @@
               <a:graphicData uri="http://schemas.openxmlformats.org/drawingml/2006/picture">
                 <pic:pic xmlns:pic="http://schemas.openxmlformats.org/drawingml/2006/picture">
                   <pic:nvPicPr>
-                    <pic:cNvPr id="409500208" name="Picture 8" descr="A graph with green and purple lines&#10;&#10;AI-generated content may be incorrect."/>
+                    <pic:cNvPr id="1468839607" name="Picture 5" descr="A screenshot of a computer&#10;&#10;AI-generated content may be incorrect."/>
                     <pic:cNvPicPr/>
                   </pic:nvPicPr>
                   <pic:blipFill>
-                    <a:blip r:embed="rId12">
+                    <a:blip r:embed="rId12" cstate="print">
                       <a:extLst>
                         <a:ext uri="{28A0092B-C50C-407E-A947-70E740481C1C}">
                           <a14:useLocalDpi xmlns:a14="http://schemas.microsoft.com/office/drawing/2010/main" val="0"/>
@@ -1466,7 +1558,7 @@
                   <pic:spPr>
                     <a:xfrm>
                       <a:off x="0" y="0"/>
-                      <a:ext cx="4356072" cy="3267055"/>
+                      <a:ext cx="4346459" cy="2290716"/>
                     </a:xfrm>
                     <a:prstGeom prst="rect">
                       <a:avLst/>
@@ -1481,20 +1573,6 @@
     </w:p>
     <w:p>
       <w:pPr>
-        <w:ind w:left="420"/>
-      </w:pPr>
-      <w:r>
-        <w:t xml:space="preserve">To </w:t>
-      </w:r>
-      <w:r>
-        <w:t>save</w:t>
-      </w:r>
-      <w:r>
-        <w:t xml:space="preserve"> time, I also developed another script wrapper named ‘generate_all_plots.sh’ that automatically loops through the entire list of symbols that I have and executes the plotter script for each symbol. </w:t>
-      </w:r>
-    </w:p>
-    <w:p>
-      <w:pPr>
         <w:pStyle w:val="ListParagraph"/>
         <w:numPr>
           <w:ilvl w:val="0"/>
@@ -1514,118 +1592,7 @@
           <w:sz w:val="30"/>
           <w:szCs w:val="30"/>
         </w:rPr>
-        <w:t xml:space="preserve">Version Control (Git) </w:t>
-      </w:r>
-    </w:p>
-    <w:p>
-      <w:pPr>
-        <w:ind w:left="360"/>
-      </w:pPr>
-      <w:r>
-        <w:t xml:space="preserve">Throughout the process of coding, I utilized Git. This was especially helpful in terms of debugging my code in the Moving Average section. </w:t>
-      </w:r>
-    </w:p>
-    <w:p>
-      <w:pPr>
-        <w:pStyle w:val="ListParagraph"/>
-        <w:numPr>
-          <w:ilvl w:val="0"/>
-          <w:numId w:val="5"/>
-        </w:numPr>
-      </w:pPr>
-      <w:r>
-        <w:rPr>
-          <w:b/>
-          <w:bCs/>
-        </w:rPr>
-        <w:t>Commit History:</w:t>
-      </w:r>
-      <w:r>
-        <w:rPr>
-          <w:rFonts w:hint="eastAsia"/>
-          <w:b/>
-          <w:bCs/>
-        </w:rPr>
-        <w:t xml:space="preserve"> </w:t>
-      </w:r>
-      <w:r>
-        <w:t xml:space="preserve">I made commits when I finished </w:t>
-      </w:r>
-      <w:proofErr w:type="gramStart"/>
-      <w:r>
-        <w:t>particular features</w:t>
-      </w:r>
-      <w:proofErr w:type="gramEnd"/>
-      <w:r>
-        <w:t xml:space="preserve"> (such as "</w:t>
-      </w:r>
-      <w:r>
-        <w:t>Creating database</w:t>
-      </w:r>
-      <w:r>
-        <w:t>" or "</w:t>
-      </w:r>
-      <w:r>
-        <w:t>Debug for calculating moving average</w:t>
-      </w:r>
-      <w:r>
-        <w:t xml:space="preserve">"). </w:t>
-      </w:r>
-    </w:p>
-    <w:p>
-      <w:pPr>
-        <w:pStyle w:val="ListParagraph"/>
-        <w:numPr>
-          <w:ilvl w:val="0"/>
-          <w:numId w:val="5"/>
-        </w:numPr>
-        <w:rPr>
-          <w:b/>
-          <w:bCs/>
-        </w:rPr>
-      </w:pPr>
-      <w:r>
-        <w:rPr>
-          <w:b/>
-          <w:bCs/>
-        </w:rPr>
-        <w:t>Error Recovery:</w:t>
-      </w:r>
-      <w:r>
-        <w:t xml:space="preserve"> Once, I broke the database insertion loop. But since I knew I had previously committed my working code, I was able to look through code changes and correct those changes. This allowed me to return my code to the working stage. </w:t>
-      </w:r>
-    </w:p>
-    <w:p>
-      <w:pPr>
-        <w:pStyle w:val="ListParagraph"/>
-        <w:ind w:left="1080"/>
-        <w:rPr>
-          <w:b/>
-          <w:bCs/>
-        </w:rPr>
-      </w:pPr>
-    </w:p>
-    <w:p>
-      <w:pPr>
-        <w:pStyle w:val="ListParagraph"/>
-        <w:numPr>
-          <w:ilvl w:val="0"/>
-          <w:numId w:val="1"/>
-        </w:numPr>
-        <w:rPr>
-          <w:b/>
-          <w:bCs/>
-          <w:sz w:val="30"/>
-          <w:szCs w:val="30"/>
-        </w:rPr>
-      </w:pPr>
-      <w:r>
-        <w:rPr>
-          <w:b/>
-          <w:bCs/>
-          <w:sz w:val="30"/>
-          <w:szCs w:val="30"/>
-        </w:rPr>
+        <w:lastRenderedPageBreak/>
         <w:t xml:space="preserve">Conclusion </w:t>
       </w:r>
     </w:p>

</xml_diff>